<commit_message>
fix(docs): correccion de formato de imagenes png en documento Word para correcta visualizacion
</commit_message>
<xml_diff>
--- a/documentacion_informatica/FLUJOGRAMA_DATOS_Y_TRABAJO_FUNCIONARIOS.docx
+++ b/documentacion_informatica/FLUJOGRAMA_DATOS_Y_TRABAJO_FUNCIONARIOS.docx
@@ -592,7 +592,7 @@
       <w:r>
         <w:drawing>
           <wp:inline distT="0" distB="0" distL="0" distR="0">
-            <wp:extent cx="5905500" cy="1524000"/>
+            <wp:extent cx="5143500" cy="1647825"/>
             <wp:effectExtent t="0" r="0" b="0" l="0"/>
             <wp:docPr id="1" name="" descr="" title=""/>
             <wp:cNvGraphicFramePr>
@@ -617,7 +617,7 @@
                   <pic:spPr bwMode="auto">
                     <a:xfrm>
                       <a:off x="0" y="0"/>
-                      <a:ext cx="5905500" cy="1524000"/>
+                      <a:ext cx="5143500" cy="1647825"/>
                     </a:xfrm>
                     <a:prstGeom prst="rect">
                       <a:avLst/>
@@ -707,7 +707,7 @@
       <w:r>
         <w:drawing>
           <wp:inline distT="0" distB="0" distL="0" distR="0">
-            <wp:extent cx="5524500" cy="2476500"/>
+            <wp:extent cx="4572000" cy="4448175"/>
             <wp:effectExtent t="0" r="0" b="0" l="0"/>
             <wp:docPr id="2" name="" descr="" title=""/>
             <wp:cNvGraphicFramePr>
@@ -732,7 +732,7 @@
                   <pic:spPr bwMode="auto">
                     <a:xfrm>
                       <a:off x="0" y="0"/>
-                      <a:ext cx="5524500" cy="2476500"/>
+                      <a:ext cx="4572000" cy="4448175"/>
                     </a:xfrm>
                     <a:prstGeom prst="rect">
                       <a:avLst/>
@@ -807,7 +807,7 @@
       <w:r>
         <w:drawing>
           <wp:inline distT="0" distB="0" distL="0" distR="0">
-            <wp:extent cx="5524500" cy="3333750"/>
+            <wp:extent cx="3619500" cy="5657850"/>
             <wp:effectExtent t="0" r="0" b="0" l="0"/>
             <wp:docPr id="3" name="" descr="" title=""/>
             <wp:cNvGraphicFramePr>
@@ -832,7 +832,7 @@
                   <pic:spPr bwMode="auto">
                     <a:xfrm>
                       <a:off x="0" y="0"/>
-                      <a:ext cx="5524500" cy="3333750"/>
+                      <a:ext cx="3619500" cy="5657850"/>
                     </a:xfrm>
                     <a:prstGeom prst="rect">
                       <a:avLst/>
@@ -907,7 +907,7 @@
       <w:r>
         <w:drawing>
           <wp:inline distT="0" distB="0" distL="0" distR="0">
-            <wp:extent cx="5524500" cy="2476500"/>
+            <wp:extent cx="4572000" cy="4695825"/>
             <wp:effectExtent t="0" r="0" b="0" l="0"/>
             <wp:docPr id="4" name="" descr="" title=""/>
             <wp:cNvGraphicFramePr>
@@ -932,7 +932,7 @@
                   <pic:spPr bwMode="auto">
                     <a:xfrm>
                       <a:off x="0" y="0"/>
-                      <a:ext cx="5524500" cy="2476500"/>
+                      <a:ext cx="4572000" cy="4695825"/>
                     </a:xfrm>
                     <a:prstGeom prst="rect">
                       <a:avLst/>
@@ -1007,7 +1007,7 @@
       <w:r>
         <w:drawing>
           <wp:inline distT="0" distB="0" distL="0" distR="0">
-            <wp:extent cx="5524500" cy="2476500"/>
+            <wp:extent cx="5334000" cy="2390775"/>
             <wp:effectExtent t="0" r="0" b="0" l="0"/>
             <wp:docPr id="5" name="" descr="" title=""/>
             <wp:cNvGraphicFramePr>
@@ -1032,7 +1032,7 @@
                   <pic:spPr bwMode="auto">
                     <a:xfrm>
                       <a:off x="0" y="0"/>
-                      <a:ext cx="5524500" cy="2476500"/>
+                      <a:ext cx="5334000" cy="2390775"/>
                     </a:xfrm>
                     <a:prstGeom prst="rect">
                       <a:avLst/>
@@ -1107,90 +1107,9 @@
       <w:r>
         <w:drawing>
           <wp:inline distT="0" distB="0" distL="0" distR="0">
-            <wp:extent cx="5524500" cy="2476500"/>
+            <wp:extent cx="5524500" cy="1543050"/>
             <wp:effectExtent t="0" r="0" b="0" l="0"/>
             <wp:docPr id="6" name="" descr="" title=""/>
-            <wp:cNvGraphicFramePr>
-              <a:graphicFrameLocks xmlns:a="http://schemas.openxmlformats.org/drawingml/2006/main" noChangeAspect="1"/>
-            </wp:cNvGraphicFramePr>
-            <a:graphic xmlns:a="http://schemas.openxmlformats.org/drawingml/2006/main">
-              <a:graphicData uri="http://schemas.openxmlformats.org/drawingml/2006/picture">
-                <pic:pic xmlns:pic="http://schemas.openxmlformats.org/drawingml/2006/picture">
-                  <pic:nvPicPr>
-                    <pic:cNvPr id="0" name="" descr=""/>
-                    <pic:cNvPicPr>
-                      <a:picLocks noChangeAspect="1" noChangeArrowheads="1"/>
-                    </pic:cNvPicPr>
-                  </pic:nvPicPr>
-                  <pic:blipFill>
-                    <a:blip r:embed="rId13" cstate="none"/>
-                    <a:srcRect/>
-                    <a:stretch>
-                      <a:fillRect/>
-                    </a:stretch>
-                  </pic:blipFill>
-                  <pic:spPr bwMode="auto">
-                    <a:xfrm>
-                      <a:off x="0" y="0"/>
-                      <a:ext cx="5524500" cy="2476500"/>
-                    </a:xfrm>
-                    <a:prstGeom prst="rect">
-                      <a:avLst/>
-                    </a:prstGeom>
-                  </pic:spPr>
-                </pic:pic>
-              </a:graphicData>
-            </a:graphic>
-          </wp:inline>
-        </w:drawing>
-      </w:r>
-    </w:p>
-    <w:p>
-      <w:pPr>
-        <w:spacing w:after="240"/>
-        <w:jc w:val="center"/>
-      </w:pPr>
-      <w:r>
-        <w:rPr>
-          <w:i/>
-          <w:iCs/>
-          <w:color w:val="64748B"/>
-          <w:sz w:val="18"/>
-          <w:szCs w:val="18"/>
-        </w:rPr>
-        <w:t xml:space="preserve">Figura 6: Flujograma de la Fase 5 — Cierre, Descarga de Reportes y Métricas.</w:t>
-      </w:r>
-    </w:p>
-    <w:p>
-      <w:pPr>
-        <w:pStyle w:val="Heading1"/>
-      </w:pPr>
-      <w:r>
-        <w:rPr>
-          <w:b/>
-          <w:bCs/>
-          <w:color w:val="0369A1"/>
-          <w:sz w:val="28"/>
-          <w:szCs w:val="28"/>
-        </w:rPr>
-        <w:t xml:space="preserve">5. Cruce Relacional y Cálculo de la Participación Real</w:t>
-      </w:r>
-    </w:p>
-    <w:p>
-      <w:r>
-        <w:t xml:space="preserve">El modelo de datos separa limpiamente la identidad de la persona, la oferta del curso y la matrícula o participación, lo que permite auditar con rigor matemático la participación comunitaria:</w:t>
-      </w:r>
-    </w:p>
-    <w:p>
-      <w:pPr>
-        <w:jc w:val="center"/>
-      </w:pPr>
-      <w:r>
-        <w:drawing>
-          <wp:inline distT="0" distB="0" distL="0" distR="0">
-            <wp:extent cx="5524500" cy="3619500"/>
-            <wp:effectExtent t="0" r="0" b="0" l="0"/>
-            <wp:docPr id="7" name="" descr="" title=""/>
             <wp:cNvGraphicFramePr>
               <a:graphicFrameLocks xmlns:a="http://schemas.openxmlformats.org/drawingml/2006/main" noChangeAspect="1"/>
             </wp:cNvGraphicFramePr>
@@ -1213,7 +1132,88 @@
                   <pic:spPr bwMode="auto">
                     <a:xfrm>
                       <a:off x="0" y="0"/>
-                      <a:ext cx="5524500" cy="3619500"/>
+                      <a:ext cx="5524500" cy="1543050"/>
+                    </a:xfrm>
+                    <a:prstGeom prst="rect">
+                      <a:avLst/>
+                    </a:prstGeom>
+                  </pic:spPr>
+                </pic:pic>
+              </a:graphicData>
+            </a:graphic>
+          </wp:inline>
+        </w:drawing>
+      </w:r>
+    </w:p>
+    <w:p>
+      <w:pPr>
+        <w:spacing w:after="240"/>
+        <w:jc w:val="center"/>
+      </w:pPr>
+      <w:r>
+        <w:rPr>
+          <w:i/>
+          <w:iCs/>
+          <w:color w:val="64748B"/>
+          <w:sz w:val="18"/>
+          <w:szCs w:val="18"/>
+        </w:rPr>
+        <w:t xml:space="preserve">Figura 6: Flujograma de la Fase 5 — Cierre, Descarga de Reportes y Métricas.</w:t>
+      </w:r>
+    </w:p>
+    <w:p>
+      <w:pPr>
+        <w:pStyle w:val="Heading1"/>
+      </w:pPr>
+      <w:r>
+        <w:rPr>
+          <w:b/>
+          <w:bCs/>
+          <w:color w:val="0369A1"/>
+          <w:sz w:val="28"/>
+          <w:szCs w:val="28"/>
+        </w:rPr>
+        <w:t xml:space="preserve">5. Cruce Relacional y Cálculo de la Participación Real</w:t>
+      </w:r>
+    </w:p>
+    <w:p>
+      <w:r>
+        <w:t xml:space="preserve">El modelo de datos separa limpiamente la identidad de la persona, la oferta del curso y la matrícula o participación, lo que permite auditar con rigor matemático la participación comunitaria:</w:t>
+      </w:r>
+    </w:p>
+    <w:p>
+      <w:pPr>
+        <w:jc w:val="center"/>
+      </w:pPr>
+      <w:r>
+        <w:drawing>
+          <wp:inline distT="0" distB="0" distL="0" distR="0">
+            <wp:extent cx="4191000" cy="4076700"/>
+            <wp:effectExtent t="0" r="0" b="0" l="0"/>
+            <wp:docPr id="7" name="" descr="" title=""/>
+            <wp:cNvGraphicFramePr>
+              <a:graphicFrameLocks xmlns:a="http://schemas.openxmlformats.org/drawingml/2006/main" noChangeAspect="1"/>
+            </wp:cNvGraphicFramePr>
+            <a:graphic xmlns:a="http://schemas.openxmlformats.org/drawingml/2006/main">
+              <a:graphicData uri="http://schemas.openxmlformats.org/drawingml/2006/picture">
+                <pic:pic xmlns:pic="http://schemas.openxmlformats.org/drawingml/2006/picture">
+                  <pic:nvPicPr>
+                    <pic:cNvPr id="0" name="" descr=""/>
+                    <pic:cNvPicPr>
+                      <a:picLocks noChangeAspect="1" noChangeArrowheads="1"/>
+                    </pic:cNvPicPr>
+                  </pic:nvPicPr>
+                  <pic:blipFill>
+                    <a:blip r:embed="rId15" cstate="none"/>
+                    <a:srcRect/>
+                    <a:stretch>
+                      <a:fillRect/>
+                    </a:stretch>
+                  </pic:blipFill>
+                  <pic:spPr bwMode="auto">
+                    <a:xfrm>
+                      <a:off x="0" y="0"/>
+                      <a:ext cx="4191000" cy="4076700"/>
                     </a:xfrm>
                     <a:prstGeom prst="rect">
                       <a:avLst/>

</xml_diff>